<commit_message>
Remove page breaks, add two-column MCQs
</commit_message>
<xml_diff>
--- a/Joints_and_Sutures_Notes.docx
+++ b/Joints_and_Sutures_Notes.docx
@@ -66,11 +66,6 @@
           <w:sz w:val="20"/>
         </w:rPr>
         <w:t>For: NEET | AIIMS | JIPMER | GPAT | University Exams</w:t>
-      </w:r>
-    </w:p>
-    <w:p>
-      <w:r>
-        <w:br w:type="page"/>
       </w:r>
     </w:p>
     <w:p>
@@ -311,11 +306,6 @@
         </w:tc>
       </w:tr>
     </w:tbl>
-    <w:p>
-      <w:r>
-        <w:br w:type="page"/>
-      </w:r>
-    </w:p>
     <w:p>
       <w:pPr>
         <w:pStyle w:val="Heading1"/>
@@ -1154,11 +1144,6 @@
       </w:tr>
     </w:tbl>
     <w:p>
-      <w:r>
-        <w:br w:type="page"/>
-      </w:r>
-    </w:p>
-    <w:p>
       <w:pPr>
         <w:pStyle w:val="Heading1"/>
       </w:pPr>
@@ -1694,11 +1679,6 @@
         </w:tc>
       </w:tr>
     </w:tbl>
-    <w:p>
-      <w:r>
-        <w:br w:type="page"/>
-      </w:r>
-    </w:p>
     <w:p>
       <w:pPr>
         <w:pStyle w:val="Heading1"/>
@@ -2318,11 +2298,6 @@
       </w:r>
     </w:p>
     <w:p>
-      <w:r>
-        <w:br w:type="page"/>
-      </w:r>
-    </w:p>
-    <w:p>
       <w:pPr>
         <w:pStyle w:val="Heading1"/>
       </w:pPr>
@@ -3107,11 +3082,6 @@
         </w:tc>
       </w:tr>
     </w:tbl>
-    <w:p>
-      <w:r>
-        <w:br w:type="page"/>
-      </w:r>
-    </w:p>
     <w:p>
       <w:pPr>
         <w:pStyle w:val="Heading2"/>
@@ -3878,11 +3848,6 @@
       </w:tr>
     </w:tbl>
     <w:p>
-      <w:r>
-        <w:br w:type="page"/>
-      </w:r>
-    </w:p>
-    <w:p>
       <w:pPr>
         <w:pStyle w:val="Heading2"/>
       </w:pPr>
@@ -5464,11 +5429,6 @@
       </w:tr>
     </w:tbl>
     <w:p>
-      <w:r>
-        <w:br w:type="page"/>
-      </w:r>
-    </w:p>
-    <w:p>
       <w:pPr>
         <w:pStyle w:val="Heading2"/>
       </w:pPr>
@@ -5773,11 +5733,6 @@
       </w:tr>
     </w:tbl>
     <w:p>
-      <w:r>
-        <w:br w:type="page"/>
-      </w:r>
-    </w:p>
-    <w:p>
       <w:pPr>
         <w:pStyle w:val="Heading1"/>
       </w:pPr>
@@ -6600,11 +6555,6 @@
       </w:tr>
     </w:tbl>
     <w:p>
-      <w:r>
-        <w:br w:type="page"/>
-      </w:r>
-    </w:p>
-    <w:p>
       <w:pPr>
         <w:pStyle w:val="Heading2"/>
       </w:pPr>
@@ -7215,11 +7165,6 @@
         </w:tc>
       </w:tr>
     </w:tbl>
-    <w:p>
-      <w:r>
-        <w:br w:type="page"/>
-      </w:r>
-    </w:p>
     <w:p>
       <w:pPr>
         <w:pStyle w:val="Heading1"/>
@@ -7687,11 +7632,6 @@
         </w:tc>
       </w:tr>
     </w:tbl>
-    <w:p>
-      <w:r>
-        <w:br w:type="page"/>
-      </w:r>
-    </w:p>
     <w:p>
       <w:pPr>
         <w:pStyle w:val="Heading2"/>
@@ -8708,11 +8648,6 @@
         </w:tc>
       </w:tr>
     </w:tbl>
-    <w:p>
-      <w:r>
-        <w:br w:type="page"/>
-      </w:r>
-    </w:p>
     <w:p>
       <w:pPr>
         <w:pStyle w:val="Heading2"/>
@@ -9422,11 +9357,6 @@
       </w:tr>
     </w:tbl>
     <w:p>
-      <w:r>
-        <w:br w:type="page"/>
-      </w:r>
-    </w:p>
-    <w:p>
       <w:pPr>
         <w:pStyle w:val="Heading2"/>
       </w:pPr>
@@ -10512,11 +10442,6 @@
       </w:tr>
     </w:tbl>
     <w:p>
-      <w:r>
-        <w:br w:type="page"/>
-      </w:r>
-    </w:p>
-    <w:p>
       <w:pPr>
         <w:pStyle w:val="Heading2"/>
       </w:pPr>
@@ -11344,9 +11269,14 @@
       </w:tr>
     </w:tbl>
     <w:p>
-      <w:r>
-        <w:br w:type="page"/>
-      </w:r>
+      <w:pPr>
+        <w:sectPr>
+          <w:pgSz w:w="12240" w:h="20160"/>
+          <w:pgMar w:top="720" w:right="720" w:bottom="720" w:left="720" w:header="720" w:footer="720" w:gutter="0"/>
+          <w:cols w:space="720"/>
+          <w:docGrid w:linePitch="360"/>
+        </w:sectPr>
+      </w:pPr>
     </w:p>
     <w:p>
       <w:pPr>
@@ -11909,11 +11839,6 @@
       </w:r>
     </w:p>
     <w:p>
-      <w:r>
-        <w:br w:type="page"/>
-      </w:r>
-    </w:p>
-    <w:p>
       <w:pPr>
         <w:spacing w:before="80" w:after="20" w:line="240" w:lineRule="auto"/>
       </w:pPr>
@@ -12414,11 +12339,6 @@
       </w:r>
     </w:p>
     <w:p>
-      <w:r>
-        <w:br w:type="page"/>
-      </w:r>
-    </w:p>
-    <w:p>
       <w:pPr>
         <w:spacing w:before="80" w:after="20" w:line="240" w:lineRule="auto"/>
       </w:pPr>
@@ -12921,11 +12841,6 @@
       </w:r>
     </w:p>
     <w:p>
-      <w:r>
-        <w:br w:type="page"/>
-      </w:r>
-    </w:p>
-    <w:p>
       <w:pPr>
         <w:spacing w:before="80" w:after="20" w:line="240" w:lineRule="auto"/>
       </w:pPr>
@@ -13428,11 +13343,6 @@
       </w:r>
     </w:p>
     <w:p>
-      <w:r>
-        <w:br w:type="page"/>
-      </w:r>
-    </w:p>
-    <w:p>
       <w:pPr>
         <w:spacing w:before="80" w:after="20" w:line="240" w:lineRule="auto"/>
       </w:pPr>
@@ -13935,11 +13845,6 @@
       </w:r>
     </w:p>
     <w:p>
-      <w:r>
-        <w:br w:type="page"/>
-      </w:r>
-    </w:p>
-    <w:p>
       <w:pPr>
         <w:spacing w:before="80" w:after="20" w:line="240" w:lineRule="auto"/>
       </w:pPr>
@@ -14192,9 +14097,15 @@
       </w:r>
     </w:p>
     <w:p>
-      <w:r>
-        <w:br w:type="page"/>
-      </w:r>
+      <w:pPr>
+        <w:sectPr>
+          <w:pgSz w:w="12240" w:h="20160"/>
+          <w:pgMar w:top="720" w:right="720" w:bottom="720" w:left="720" w:header="720" w:footer="720" w:gutter="0"/>
+          <w:cols w:space="720"/>
+          <w:docGrid w:linePitch="360"/>
+          <w:cols w:num="2" w:space="360"/>
+        </w:sectPr>
+      </w:pPr>
     </w:p>
     <w:p>
       <w:pPr>
@@ -16298,6 +16209,8 @@
       <w:pgMar w:top="720" w:right="720" w:bottom="720" w:left="720" w:header="720" w:footer="720" w:gutter="0"/>
       <w:cols w:space="720"/>
       <w:docGrid w:linePitch="360"/>
+      <w:cols w:num="2" w:space="360"/>
+      <w:cols w:num="1"/>
     </w:sectPr>
   </w:body>
 </w:document>

</xml_diff>